<commit_message>
Tighten summary, bullets, tense and skills order in resume and CV
Co-Authored-By: Claude Sonnet 5.5 <noreply@anthropic.com>
</commit_message>
<xml_diff>
--- a/cv-RuedaBecerrilJM-plain.docx
+++ b/cv-RuedaBecerrilJM-plain.docx
@@ -28,7 +28,7 @@
       <w:r>
         <w:t xml:space="preserve">  |  </w:t>
       </w:r>
-      <w:hyperlink w:history="1" r:id="rId9cjw9plygxzcmduecfven">
+      <w:hyperlink w:history="1" r:id="rIdh-g_y9jx3erqayelk1xhr">
         <w:r>
           <w:t xml:space="preserve">jm.ruebe@gmail.com</w:t>
         </w:r>
@@ -42,7 +42,7 @@
       <w:r>
         <w:t xml:space="preserve">  |  </w:t>
       </w:r>
-      <w:hyperlink w:history="1" r:id="rIdfpakxifegouz6xzf8nsoq">
+      <w:hyperlink w:history="1" r:id="rIdn_dbrlfveprj0hic_yo_8">
         <w:r>
           <w:t xml:space="preserve">linkedin.com/in/jeruebe</w:t>
         </w:r>
@@ -53,7 +53,7 @@
         <w:spacing w:after="60"/>
         <w:jc w:val="center"/>
       </w:pPr>
-      <w:hyperlink w:history="1" r:id="rId77n8nhsyx1q9erh-kdkqs">
+      <w:hyperlink w:history="1" r:id="rIdxqoomjzexqtzhj9oiabg0">
         <w:r>
           <w:t xml:space="preserve">altjerue.github.io</w:t>
         </w:r>
@@ -61,7 +61,7 @@
       <w:r>
         <w:t xml:space="preserve">  |  </w:t>
       </w:r>
-      <w:hyperlink w:history="1" r:id="rIdao9fgxtxkelwkdfihxq2j">
+      <w:hyperlink w:history="1" r:id="rIdgv4p_sns4dwbjet5seoyi">
         <w:r>
           <w:t xml:space="preserve">github.com/altjerue</w:t>
         </w:r>
@@ -69,7 +69,7 @@
       <w:r>
         <w:t xml:space="preserve">  |  </w:t>
       </w:r>
-      <w:hyperlink w:history="1" r:id="rIdmmyrhwhb0fygp69m8zgdb">
+      <w:hyperlink w:history="1" r:id="rIdv5ugtzp4texbuosrdj_rh">
         <w:r>
           <w:t xml:space="preserve">orcid.org/0000-0003-1988-1912</w:t>
         </w:r>
@@ -77,7 +77,7 @@
       <w:r>
         <w:t xml:space="preserve">  |  </w:t>
       </w:r>
-      <w:hyperlink w:history="1" r:id="rIdayegtoelihrquu5fwvmur">
+      <w:hyperlink w:history="1" r:id="rIdmmvod66u9tudpbdhxdybr">
         <w:r>
           <w:t xml:space="preserve">Google Scholar</w:t>
         </w:r>
@@ -93,7 +93,7 @@
     </w:p>
     <w:p>
       <w:r>
-        <w:t xml:space="preserve">Computational Scientist with a PhD in Physics and 10+ years developing high-performance numerical algorithms and physics-based simulations. Expertise in scientific machine learning and geospatial data analysis. Strong mathematical foundations with a track record of architecting open-source simulation libraries, leading funded research projects, and translating complex physical models into production-quality scientific software. Experienced working across cross-functional research and engineering teams.</w:t>
+        <w:t xml:space="preserve">Computational Scientist (PhD, Physics) with 10+ years building high-performance numerical algorithms and physics-based simulations. Expertise in scientific machine learning and geospatial data analysis. Architect of open-source simulation libraries, leader of funded research projects, and translator of complex physical models into production-quality scientific software across cross-functional research and engineering teams.</w:t>
       </w:r>
     </w:p>
     <w:p>
@@ -116,7 +116,7 @@
         <w:t xml:space="preserve">Languages: </w:t>
       </w:r>
       <w:r>
-        <w:t xml:space="preserve">Python, C/C++, Fortran 95, R, SQL, Shell, Rust, Java, Julia</w:t>
+        <w:t xml:space="preserve">Python, C/C++, R, Rust, SQL, Fortran 95, Java, Julia, Shell</w:t>
       </w:r>
     </w:p>
     <w:p>
@@ -131,7 +131,7 @@
         <w:t xml:space="preserve">ML &amp; Data: </w:t>
       </w:r>
       <w:r>
-        <w:t xml:space="preserve">Scientific ML, PyTorch, TensorFlow, scikit-learn, NumPy, SciPy, Pandas, Astropy, ML-assisted parameter estimation, gradient-based optimization, SVM, random forest, neural networks</w:t>
+        <w:t xml:space="preserve">Scientific ML, PyTorch, scikit-learn, TensorFlow, random forest, neural networks, SVM, gradient-based optimization, ML-assisted parameter estimation, NumPy, SciPy, Pandas, Astropy</w:t>
       </w:r>
     </w:p>
     <w:p>
@@ -158,6 +158,21 @@
           <w:b/>
           <w:bCs/>
         </w:rPr>
+        <w:t xml:space="preserve">Simulation: </w:t>
+      </w:r>
+      <w:r>
+        <w:t xml:space="preserve">Physics simulation (multiscale/multiphysics modeling, radiative transfer, relativistic MHD, Lagrangian particle dynamics), numerical PDEs (advection–diffusion, Fokker–Planck), finite difference/volume methods, numerical linear algebra, synthetic dataset generation, uncertainty quantification, parameter estimation</w:t>
+      </w:r>
+    </w:p>
+    <w:p>
+      <w:pPr>
+        <w:spacing w:after="20"/>
+      </w:pPr>
+      <w:r>
+        <w:rPr>
+          <w:b/>
+          <w:bCs/>
+        </w:rPr>
         <w:t xml:space="preserve">HPC &amp; Parallel: </w:t>
       </w:r>
       <w:r>
@@ -173,25 +188,10 @@
           <w:b/>
           <w:bCs/>
         </w:rPr>
-        <w:t xml:space="preserve">Simulation: </w:t>
-      </w:r>
-      <w:r>
-        <w:t xml:space="preserve">Physics simulation (multiscale/multiphysics modeling, radiative transfer, relativistic MHD, Lagrangian particle dynamics), numerical PDEs (advection–diffusion, Fokker–Planck), finite difference/volume methods, numerical linear algebra, synthetic dataset generation, uncertainty quantification, parameter estimation</w:t>
-      </w:r>
-    </w:p>
-    <w:p>
-      <w:pPr>
-        <w:spacing w:after="20"/>
-      </w:pPr>
-      <w:r>
-        <w:rPr>
-          <w:b/>
-          <w:bCs/>
-        </w:rPr>
         <w:t xml:space="preserve">Tools: </w:t>
       </w:r>
       <w:r>
-        <w:t xml:space="preserve">Git, Docker, Azure, Jenkins, Kafka, Jira, QGIS, ParaView, VisIt</w:t>
+        <w:t xml:space="preserve">Git, Docker, Azure, Jenkins, Kafka, Jira, ParaView, VisIt</w:t>
       </w:r>
     </w:p>
     <w:p>
@@ -256,7 +256,7 @@
         <w:spacing w:after="10"/>
       </w:pPr>
       <w:r>
-        <w:t xml:space="preserve">Physics expert for a leading AI lab: reviewed 50+ expert-level problems in physics, hydrodynamics, astrophysics, and cosmology; wrote original prompts that stumped frontier models.</w:t>
+        <w:t xml:space="preserve">Review 50+ expert-level physics, hydrodynamics, astrophysics, and cosmology problems for a leading AI lab; write original prompts that stump frontier models.</w:t>
       </w:r>
     </w:p>
     <w:p>
@@ -452,7 +452,7 @@
         <w:spacing w:after="10"/>
       </w:pPr>
       <w:r>
-        <w:t xml:space="preserve">Co-developed Tleco, a Rust/Python toolkit that models radiation from relativistic outflows by solving the Fokker–Planck equation coupled to radiative transfer; published in ApJ (2024) [9].</w:t>
+        <w:t xml:space="preserve">Co-developed Tleco, a Rust/Python toolkit that solves the Fokker–Planck equation coupled to radiative transfer to model radiation from relativistic outflows (ApJ 2024) [9].</w:t>
       </w:r>
     </w:p>
     <w:p>
@@ -648,7 +648,7 @@
         <w:spacing w:after="10"/>
       </w:pPr>
       <w:r>
-        <w:t xml:space="preserve">Led a 7-person team upgrading PatchworkMHD, a C code for magnetohydrodynamic simulations of supermassive black hole binaries, in an NSF-funded project.</w:t>
+        <w:t xml:space="preserve">Led a 7-person team upgrading PatchworkMHD, a C code for magnetohydrodynamic simulations of supermassive black hole binaries.</w:t>
       </w:r>
     </w:p>
     <w:p>
@@ -798,7 +798,7 @@
         <w:spacing w:after="10"/>
       </w:pPr>
       <w:r>
-        <w:t xml:space="preserve">Co-I on two NASA Fermi Guest Investigator proposals; one was funded ($68K) and supported the finding that blazar jets are launched with similar energy per baryon, independently of their power [5].</w:t>
+        <w:t xml:space="preserve">Served as co-I on two NASA Fermi Guest Investigator proposals; the funded one ($68K) supported the finding that blazar jets launch with similar energy per baryon, independently of their power [5].</w:t>
       </w:r>
     </w:p>
     <w:p>
@@ -1132,7 +1132,7 @@
       <w:r>
         <w:t xml:space="preserve">Thesis: </w:t>
       </w:r>
-      <w:hyperlink w:history="1" r:id="rIdfg2kg9islwvgvbgrvuojf">
+      <w:hyperlink w:history="1" r:id="rIdp7xbkidcfe9ifkjz-ws7v">
         <w:r>
           <w:t xml:space="preserve">Numerical treatment of radiation processes in the internal shocks of magnetized relativistic outflows</w:t>
         </w:r>
@@ -1429,7 +1429,7 @@
       <w:r>
         <w:t xml:space="preserve">, </w:t>
       </w:r>
-      <w:hyperlink w:history="1" r:id="rIds7agoomiynzbdi5xnp35b">
+      <w:hyperlink w:history="1" r:id="rId8yc6cf0vibqpqtfcrslay">
         <w:r>
           <w:t xml:space="preserve">ApJ 976, 182 (2024)</w:t>
         </w:r>
@@ -1437,7 +1437,7 @@
       <w:r>
         <w:t xml:space="preserve">, </w:t>
       </w:r>
-      <w:hyperlink w:history="1" r:id="rIdibzlp7ftnssnqaf4vhome">
+      <w:hyperlink w:history="1" r:id="rId-tchqbhxczysww5o8ctbl">
         <w:r>
           <w:t xml:space="preserve">arXiv:2405.17581</w:t>
         </w:r>
@@ -1474,7 +1474,7 @@
       <w:r>
         <w:t xml:space="preserve">, </w:t>
       </w:r>
-      <w:hyperlink w:history="1" r:id="rIdmc-tsj-vypwyyv4tpxlcb">
+      <w:hyperlink w:history="1" r:id="rId0zrfddslhatgl6kgeomoj">
         <w:r>
           <w:t xml:space="preserve">MNRAS 513, 5766–5779 (2022)</w:t>
         </w:r>
@@ -1482,7 +1482,7 @@
       <w:r>
         <w:t xml:space="preserve">, </w:t>
       </w:r>
-      <w:hyperlink w:history="1" r:id="rIdhzhausn3fz5d7enqfpd_3">
+      <w:hyperlink w:history="1" r:id="rId6h4qeauntfp9dldogjhlp">
         <w:r>
           <w:t xml:space="preserve">arXiv:2201.07790</w:t>
         </w:r>
@@ -1519,7 +1519,7 @@
       <w:r>
         <w:t xml:space="preserve">, </w:t>
       </w:r>
-      <w:hyperlink w:history="1" r:id="rIdb6ynpfwskemcqxzriggay">
+      <w:hyperlink w:history="1" r:id="rIdiu51dohcteib6tfdrjgq3">
         <w:r>
           <w:t xml:space="preserve">Phys. Rev. D 106, 083015 (2022)</w:t>
         </w:r>
@@ -1527,7 +1527,7 @@
       <w:r>
         <w:t xml:space="preserve">, </w:t>
       </w:r>
-      <w:hyperlink w:history="1" r:id="rIdg_7s-ackv7ex1ct_1adeu">
+      <w:hyperlink w:history="1" r:id="rIdtymv1y7jss646aetb5heg">
         <w:r>
           <w:t xml:space="preserve">arXiv:2112.09817</w:t>
         </w:r>
@@ -1564,7 +1564,7 @@
       <w:r>
         <w:t xml:space="preserve">, </w:t>
       </w:r>
-      <w:hyperlink w:history="1" r:id="rIdbileaxcmviwvvfvqzqkbg">
+      <w:hyperlink w:history="1" r:id="rIdpx4ry42oug8_0tz6tztwo">
         <w:r>
           <w:t xml:space="preserve">ApJ 919, 95 (2021)</w:t>
         </w:r>
@@ -1572,7 +1572,7 @@
       <w:r>
         <w:t xml:space="preserve">, </w:t>
       </w:r>
-      <w:hyperlink w:history="1" r:id="rIdycdrdshos3y5eswcpymka">
+      <w:hyperlink w:history="1" r:id="rId4lb_gdbluiaf88vyfclaj">
         <w:r>
           <w:t xml:space="preserve">arXiv:2106.05356</w:t>
         </w:r>
@@ -1609,7 +1609,7 @@
       <w:r>
         <w:t xml:space="preserve">, </w:t>
       </w:r>
-      <w:hyperlink w:history="1" r:id="rIdlk6ygazek7xapxq1z-mah">
+      <w:hyperlink w:history="1" r:id="rIdca2z0hnztujz3lpvkppas">
         <w:r>
           <w:t xml:space="preserve">MNRAS 501, 4092–4102 (2021)</w:t>
         </w:r>
@@ -1617,7 +1617,7 @@
       <w:r>
         <w:t xml:space="preserve">, </w:t>
       </w:r>
-      <w:hyperlink w:history="1" r:id="rIdvjy0zdnvmft6qx5svsqc5">
+      <w:hyperlink w:history="1" r:id="rIdgqdnmrvbor92bwct5mbz9">
         <w:r>
           <w:t xml:space="preserve">arXiv:2009.02273</w:t>
         </w:r>
@@ -1654,7 +1654,7 @@
       <w:r>
         <w:t xml:space="preserve">, </w:t>
       </w:r>
-      <w:hyperlink w:history="1" r:id="rIdasgz_kh7kaqkthzj5nzw-">
+      <w:hyperlink w:history="1" r:id="rIdnx_595t2oa-rfo2sfnkqx">
         <w:r>
           <w:t xml:space="preserve">MNRAS 496, 974–986 (2020)</w:t>
         </w:r>
@@ -1662,7 +1662,7 @@
       <w:r>
         <w:t xml:space="preserve">, </w:t>
       </w:r>
-      <w:hyperlink w:history="1" r:id="rIdkwe6h0z9w9cipgw9zhugf">
+      <w:hyperlink w:history="1" r:id="rIdu8cakt89zknkrcm9rvnzk">
         <w:r>
           <w:t xml:space="preserve">arXiv:1910.14049</w:t>
         </w:r>
@@ -1699,7 +1699,7 @@
       <w:r>
         <w:t xml:space="preserve">, </w:t>
       </w:r>
-      <w:hyperlink w:history="1" r:id="rIdtfke7cetcu9ukmhpfrewd">
+      <w:hyperlink w:history="1" r:id="rIda4lttphdyln4tsew9buiz">
         <w:r>
           <w:t xml:space="preserve">MNRAS 468, 1169–1182 (2017)</w:t>
         </w:r>
@@ -1707,7 +1707,7 @@
       <w:r>
         <w:t xml:space="preserve">, </w:t>
       </w:r>
-      <w:hyperlink w:history="1" r:id="rIdv1tov1bamf6dh64zj8ma9">
+      <w:hyperlink w:history="1" r:id="rIdnp84zko_fnuxxozjjh3rn">
         <w:r>
           <w:t xml:space="preserve">arXiv:1612.06383</w:t>
         </w:r>
@@ -1744,7 +1744,7 @@
       <w:r>
         <w:t xml:space="preserve">, </w:t>
       </w:r>
-      <w:hyperlink w:history="1" r:id="rIdqzplzm_ih3-5_7khpqnd9">
+      <w:hyperlink w:history="1" r:id="rIdeompryomyxjkpw484vrgq">
         <w:r>
           <w:t xml:space="preserve">MNRAS 438, 1856–1869 (2014)</w:t>
         </w:r>
@@ -1752,7 +1752,7 @@
       <w:r>
         <w:t xml:space="preserve">, </w:t>
       </w:r>
-      <w:hyperlink w:history="1" r:id="rIdxohlwuktwqmdwlvpmmtvd">
+      <w:hyperlink w:history="1" r:id="rIdqzx8p2yr001uukgvnnywu">
         <w:r>
           <w:t xml:space="preserve">arXiv:1310.5441</w:t>
         </w:r>
@@ -1789,7 +1789,7 @@
       <w:r>
         <w:t xml:space="preserve">, </w:t>
       </w:r>
-      <w:hyperlink w:history="1" r:id="rId6qwg1hq9l9uz5y0f5sllt">
+      <w:hyperlink w:history="1" r:id="rIdyhz3ekij00piyospenys4">
         <w:r>
           <w:t xml:space="preserve">Phys. Rev. D 80, 084023 (2009)</w:t>
         </w:r>
@@ -1797,7 +1797,7 @@
       <w:r>
         <w:t xml:space="preserve">, </w:t>
       </w:r>
-      <w:hyperlink w:history="1" r:id="rId-zpgtkupkc4p1timjw2l7">
+      <w:hyperlink w:history="1" r:id="rIdo3giszwkzg5oha9qouhmy">
         <w:r>
           <w:t xml:space="preserve">arXiv:1009.1250</w:t>
         </w:r>
@@ -1842,7 +1842,7 @@
       <w:r>
         <w:t xml:space="preserve">, </w:t>
       </w:r>
-      <w:hyperlink w:history="1" r:id="rIdi6grzsf-a3wsv9w9yz4hz">
+      <w:hyperlink w:history="1" r:id="rId2x6dmqxjxszp5kyvryw7f">
         <w:r>
           <w:t xml:space="preserve">Astron. Nachr. 342, 277–282 (2021)</w:t>
         </w:r>
@@ -1850,7 +1850,7 @@
       <w:r>
         <w:t xml:space="preserve">, 9th International Workshop on Astronomy and Relativistic Astrophysics, </w:t>
       </w:r>
-      <w:hyperlink w:history="1" r:id="rIdt0qc1105bhjk1etcnghah">
+      <w:hyperlink w:history="1" r:id="rId_8u6jgqhqq2vk95pnofam">
         <w:r>
           <w:t xml:space="preserve">arXiv:2011.13797</w:t>
         </w:r>
@@ -1887,7 +1887,7 @@
       <w:r>
         <w:t xml:space="preserve">, </w:t>
       </w:r>
-      <w:hyperlink w:history="1" r:id="rIdnwy17ypkgis3dz0as6ys9">
+      <w:hyperlink w:history="1" r:id="rIdmznbxsv_t5n_v6f7bsr0b">
         <w:r>
           <w:t xml:space="preserve">Astron. Nachr. 342, 147–152 (2021)</w:t>
         </w:r>
@@ -1895,7 +1895,7 @@
       <w:r>
         <w:t xml:space="preserve">, 9th International Workshop on Astronomy and Relativistic Astrophysics, </w:t>
       </w:r>
-      <w:hyperlink w:history="1" r:id="rIdvq3le4jjdp3plfyev0zbk">
+      <w:hyperlink w:history="1" r:id="rIdi3ptqva0aoy_g_boua26s">
         <w:r>
           <w:t xml:space="preserve">arXiv:2011.13805</w:t>
         </w:r>
@@ -1932,7 +1932,7 @@
       <w:r>
         <w:t xml:space="preserve">, </w:t>
       </w:r>
-      <w:hyperlink w:history="1" r:id="rIdroofnw_ou7n7p5izsvxqr">
+      <w:hyperlink w:history="1" r:id="rIdtvhmz_me23zlfby78f_kk">
         <w:r>
           <w:t xml:space="preserve">PoS(SWIFT 10) 233, 159 (2014)</w:t>
         </w:r>
@@ -1940,7 +1940,7 @@
       <w:r>
         <w:t xml:space="preserve">, </w:t>
       </w:r>
-      <w:hyperlink w:history="1" r:id="rIdzuv5u1niseivdplx_as0c">
+      <w:hyperlink w:history="1" r:id="rId7xlckjju86utiaufqxy3l">
         <w:r>
           <w:t xml:space="preserve">arXiv:1502.07882</w:t>
         </w:r>
@@ -1977,7 +1977,7 @@
       <w:r>
         <w:t xml:space="preserve">, </w:t>
       </w:r>
-      <w:hyperlink w:history="1" r:id="rId2ynzucxaorszqiqhpwr6o">
+      <w:hyperlink w:history="1" r:id="rIdodgvzdq34lzslee6oxlum">
         <w:r>
           <w:t xml:space="preserve">EPJ Web Conf. 61, 02007 (2013)</w:t>
         </w:r>
@@ -1985,7 +1985,7 @@
       <w:r>
         <w:t xml:space="preserve">, </w:t>
       </w:r>
-      <w:hyperlink w:history="1" r:id="rIdirsn5vdnpj4rem8tonepv">
+      <w:hyperlink w:history="1" r:id="rIdc3-r06m1knuvumrbaabqz">
         <w:r>
           <w:t xml:space="preserve">arXiv:1309.4612</w:t>
         </w:r>
@@ -2022,7 +2022,7 @@
       <w:r>
         <w:t xml:space="preserve">, </w:t>
       </w:r>
-      <w:hyperlink w:history="1" r:id="rId3takcctszzbuso2_1gqmk">
+      <w:hyperlink w:history="1" r:id="rIdg8qmu0egzmdjmy6z_vrfu">
         <w:r>
           <w:t xml:space="preserve">J. Phys.: Conf. Ser. 454, 012001 (2013)</w:t>
         </w:r>
@@ -2030,7 +2030,7 @@
       <w:r>
         <w:t xml:space="preserve">, </w:t>
       </w:r>
-      <w:hyperlink w:history="1" r:id="rId4lalxla1lvs6cuti77oic">
+      <w:hyperlink w:history="1" r:id="rIdachmj1pjlwbcowmw77b_4">
         <w:r>
           <w:t xml:space="preserve">arXiv:1211.1794</w:t>
         </w:r>
@@ -2433,7 +2433,7 @@
       <w:r>
         <w:tab/>
       </w:r>
-      <w:hyperlink w:history="1" r:id="rIdvraqrtna6xpyvbwq3kaec">
+      <w:hyperlink w:history="1" r:id="rIdw8gd8sp3v7t3nmsgazfo3">
         <w:r>
           <w:t xml:space="preserve">github.com/altjerue/ilwikak-ml</w:t>
         </w:r>
@@ -2524,7 +2524,7 @@
       <w:r>
         <w:tab/>
       </w:r>
-      <w:hyperlink w:history="1" r:id="rIdcnbcm8bonttatbd0x2xew">
+      <w:hyperlink w:history="1" r:id="rIdmnqsejuewg7lpllug9i6l">
         <w:r>
           <w:t xml:space="preserve">github.com/UW-ForestMycobiomeLab/WindSporesHills</w:t>
         </w:r>
@@ -2589,7 +2589,7 @@
       <w:r>
         <w:tab/>
       </w:r>
-      <w:hyperlink w:history="1" r:id="rId2ozqqkmhzk3fj5kwwdf9_">
+      <w:hyperlink w:history="1" r:id="rIdeux8jcthxvyyobz2gdatk">
         <w:r>
           <w:t xml:space="preserve">github.com/zkdavis/Tleco</w:t>
         </w:r>
@@ -2654,7 +2654,7 @@
       <w:r>
         <w:tab/>
       </w:r>
-      <w:hyperlink w:history="1" r:id="rIdc8rytsaqnz1jcrbo5wdnt">
+      <w:hyperlink w:history="1" r:id="rIdtyfhqv4ppkmo5vazukexj">
         <w:r>
           <w:t xml:space="preserve">github.com/altjerue/paramo</w:t>
         </w:r>
@@ -3265,7 +3265,7 @@
       <w:r>
         <w:t xml:space="preserve">Video: </w:t>
       </w:r>
-      <w:hyperlink w:history="1" r:id="rId_utmnxcubrecyndegqnve">
+      <w:hyperlink w:history="1" r:id="rIdm4jxwg0vurcsu5ffsmhwe">
         <w:r>
           <w:t xml:space="preserve">youtube.com/watch?v=BAZNWLNT69M</w:t>
         </w:r>
@@ -3436,7 +3436,7 @@
       <w:r>
         <w:t xml:space="preserve">Marcos Moshinsky Award for Best Poster. Video: </w:t>
       </w:r>
-      <w:hyperlink w:history="1" r:id="rIdqb6pz67onzxui0qzr3ex9">
+      <w:hyperlink w:history="1" r:id="rIdvdlxpqqsag_0qiygezvhe">
         <w:r>
           <w:t xml:space="preserve">youtube.com/watch?v=0TJiKg7kOPI</w:t>
         </w:r>
@@ -4494,7 +4494,7 @@
       <w:pPr>
         <w:spacing w:after="0"/>
       </w:pPr>
-      <w:hyperlink w:history="1" r:id="rIdyg-z7vkq2gaahm_s9afx4">
+      <w:hyperlink w:history="1" r:id="rIdzb8x2zwxdge5xz1hfduzs">
         <w:r>
           <w:t xml:space="preserve">mexiciencia.github.io/post/anita</w:t>
         </w:r>
@@ -4554,7 +4554,7 @@
       <w:pPr>
         <w:spacing w:after="0"/>
       </w:pPr>
-      <w:hyperlink w:history="1" r:id="rIdsfra4jp5jjrrd6yrjsvgj">
+      <w:hyperlink w:history="1" r:id="rIdmrxty5ogxow28sdeet6to">
         <w:r>
           <w:t xml:space="preserve">mexiciencia.github.io/post/modelo-sir</w:t>
         </w:r>
@@ -4617,7 +4617,7 @@
       <w:r>
         <w:t xml:space="preserve">Data analysis and modeling collaborator. </w:t>
       </w:r>
-      <w:hyperlink w:history="1" r:id="rIdrkqjyzhvj6r_rmkmhoeec">
+      <w:hyperlink w:history="1" r:id="rId4lkfwhgzrjvvgxmhh2na7">
         <w:r>
           <w:t xml:space="preserve">mexiciencia.github.io/post/covid19</w:t>
         </w:r>

</xml_diff>